<commit_message>
fix: Rechtsprechung und Normenstand verifizieren
</commit_message>
<xml_diff>
--- a/docs/vertragsdokumente/bautraegervertrag-marewald/bautraegervertrag-marewald-de-en.docx
+++ b/docs/vertragsdokumente/bautraegervertrag-marewald/bautraegervertrag-marewald-de-en.docx
@@ -1650,7 +1650,7 @@
             </w:r>
             <w:r>
               <w:rPr/>
-              <w:t xml:space="preserve"> Die Baubeschreibung in der Fassung Mai 2026, Version 3.0 (Anlage Baubeschreibung zu dieser Urkunde) ist Gegenstand der Beurkundung und Bestandteil der vom Verkäufer geschuldeten Leistung. Auf das Verlesen wird nach § 13a BeurkG bzw. durch beigefügte Anlage nicht verzichtet; die Baubeschreibung wurde mitverlesen bzw. als Anlage mitbeurkundet. Visualisierungen, Exposés und die Musterwohnung sind nicht Vertragsbestandteil.</w:t>
+              <w:t xml:space="preserve"> Die Baubeschreibung in der Fassung Mai 2026, Version 3.0 (Anlage Baubeschreibung zu dieser Urkunde) ist Gegenstand der Beurkundung und Bestandteil der vom Verkäufer geschuldeten Leistung. Auf das Verlesen wird nicht verzichtet; die Baubeschreibung wurde mitverlesen und als Anlage mitbeurkundet. Visualisierungen, Exposés und die Musterwohnung sind nicht Vertragsbestandteil.</w:t>
             </w:r>
           </w:p>
         </w:tc>
@@ -1675,7 +1675,7 @@
             </w:r>
             <w:r>
               <w:rPr/>
-              <w:t xml:space="preserve"> The Building Specification in the version May 2026, version 3.0 (Appendix Building description to this certificate) is the subject of the certification and part of the service owed by the Seller. Reading is not waived in accordance with § 13a BeurkG or by attached annex; the Building Specification was also read or co-certified as a plant. Visualizations, exposés and the model apartment are not part of the contract.</w:t>
+              <w:t xml:space="preserve"> The Building Specification in the version May 2026, version 3.0 (Appendix Building description to this certificate) is the subject of the certification and part of the service owed by the Seller. Reading is not waived; the Building Specification was read aloud and notarised as an annex. Visualizations, exposés and the model apartment are not part of the contract.</w:t>
             </w:r>
           </w:p>
         </w:tc>
@@ -11010,7 +11010,7 @@
   <w:docDefaults>
     <w:rPrDefault>
       <w:rPr>
-        <w:rFonts w:ascii="Liberation Serif" w:hAnsi="Liberation Serif" w:eastAsia="Songti SC" w:cs="Arial Unicode MS"/>
+        <w:rFonts w:ascii="Liberation Serif" w:hAnsi="Liberation Serif" w:eastAsia="Linux Libertine G" w:cs="Noto Sans"/>
         <w:sz w:val="24"/>
         <w:szCs w:val="24"/>
         <w:lang w:val="en-US" w:eastAsia="zh-CN" w:bidi="hi-IN"/>
@@ -11074,7 +11074,7 @@
       <w:outlineLvl w:val="1"/>
     </w:pPr>
     <w:rPr>
-      <w:rFonts w:ascii="Liberation Serif" w:hAnsi="Liberation Serif" w:eastAsia="Songti SC" w:cs="Arial Unicode MS"/>
+      <w:rFonts w:ascii="Liberation Serif" w:hAnsi="Liberation Serif" w:eastAsia="Linux Libertine G" w:cs="Noto Sans"/>
       <w:b/>
       <w:bCs/>
       <w:sz w:val="20"/>
@@ -11096,7 +11096,7 @@
       <w:outlineLvl w:val="2"/>
     </w:pPr>
     <w:rPr>
-      <w:rFonts w:ascii="Liberation Serif" w:hAnsi="Liberation Serif" w:eastAsia="Songti SC" w:cs="Arial Unicode MS"/>
+      <w:rFonts w:ascii="Liberation Serif" w:hAnsi="Liberation Serif" w:eastAsia="Linux Libertine G" w:cs="Noto Sans"/>
       <w:b/>
       <w:bCs/>
       <w:sz w:val="18"/>
@@ -11213,7 +11213,7 @@
       <w:suppressLineNumbers/>
     </w:pPr>
     <w:rPr>
-      <w:rFonts w:cs="Arial Unicode MS"/>
+      <w:rFonts w:cs="Noto Sans"/>
     </w:rPr>
   </w:style>
   <w:style w:type="paragraph" w:styleId="Caption">
@@ -11225,7 +11225,7 @@
       <w:spacing w:before="120" w:after="120"/>
     </w:pPr>
     <w:rPr>
-      <w:rFonts w:cs="Arial Unicode MS"/>
+      <w:rFonts w:cs="Noto Sans"/>
       <w:i/>
       <w:iCs/>
       <w:sz w:val="24"/>
@@ -11237,7 +11237,7 @@
     <w:basedOn w:val="BodyText"/>
     <w:pPr/>
     <w:rPr>
-      <w:rFonts w:cs="Arial Unicode MS"/>
+      <w:rFonts w:cs="Noto Sans"/>
     </w:rPr>
   </w:style>
   <w:style w:type="paragraph" w:styleId="BlockQuotation">

</xml_diff>

<commit_message>
feat: härte Zahlungsakten und Fälligkeitsprüfung
</commit_message>
<xml_diff>
--- a/docs/vertragsdokumente/bautraegervertrag-marewald/bautraegervertrag-marewald-de-en.docx
+++ b/docs/vertragsdokumente/bautraegervertrag-marewald/bautraegervertrag-marewald-de-en.docx
@@ -3350,7 +3350,7 @@
             </w:r>
             <w:r>
               <w:rPr/>
-              <w:t xml:space="preserve"> Vorleistung. Der vor Beurkundung gezahlte Betrag von 5.000,00 EUR wird vorbehaltlos und vollständig auf die erste fällige Kaufpreisrate angerechnet. Mit der Anrechnung sind keine Verzichts-, Anerkenntnis- oder Verfallwirkungen verbunden.</w:t>
+              <w:t xml:space="preserve"> Keine Vorleistungen. Vor der Beurkundung hat der Verkäufer keine auf den Erwerb, eine Reservierung oder Sonderwünsche entfallenden Zahlungen oder Sicherheiten entgegengenommen. Kaufpreiszahlungen und Zahlungen auf bauwerksbezogene Sonderwünsche werden ausschließlich nach Maßgabe der §§ 3.1 bis 3.3 und 3.5 angefordert.</w:t>
             </w:r>
           </w:p>
         </w:tc>
@@ -3375,7 +3375,7 @@
             </w:r>
             <w:r>
               <w:rPr/>
-              <w:t xml:space="preserve"> wholesale input. The amount of 5,000.00 EUR paid before the notarization will be credited without reservation and in full to the first Purchase Price installment due. Crediting shall not entail any waiver, recognition or forfeiture effects.</w:t>
+              <w:t xml:space="preserve"> No advance payments. Before notarisation, the Seller did not accept any payment or security relating to the acquisition, a reservation or special requests. Purchase Price payments and payments for construction-related special requests shall be requested only in accordance with sections 3.1 to 3.3 and 3.5.</w:t>
             </w:r>
           </w:p>
         </w:tc>

</xml_diff>